<commit_message>
fix(pis-todo-to-tch): align signature block, exact PDF, default work week
- template/contoh: pin signature columns with explicit 4.0" tab stops;
  literal tab runs drifted the right column when the lecturer name was
  long, so "Pembimbing Lapangan" and its name looked misaligned
- PDF: convert from the generated DOCX via LibreOffice headless when
  available; keep fpdf2 as fallback + warning; report pdf_engine
- default period (no argument) is now the current work week (Mon-Fri,
  clipped to today) instead of the current month
- setup/install report LibreOffice; docs updated
</commit_message>
<xml_diff>
--- a/skills/pis-todo-to-tch/assets/contoh-log-book.docx
+++ b/skills/pis-todo-to-tch/assets/contoh-log-book.docx
@@ -3537,6 +3537,7 @@
     <w:p>
       <w:pPr>
         <w:spacing w:after="0" w:line="240" w:lineRule="auto"/>
+        <w:ind w:left="5760"/>
         <w:rPr>
           <w:rFonts w:ascii="Times New Roman" w:hAnsi="Times New Roman" w:cs="Times New Roman"/>
         </w:rPr>
@@ -3545,122 +3546,7 @@
         <w:rPr>
           <w:rFonts w:ascii="Times New Roman" w:hAnsi="Times New Roman" w:cs="Times New Roman"/>
         </w:rPr>
-        <w:tab/>
-      </w:r>
-      <w:r>
-        <w:rPr>
-          <w:rFonts w:ascii="Times New Roman" w:hAnsi="Times New Roman" w:cs="Times New Roman"/>
-        </w:rPr>
-        <w:tab/>
-      </w:r>
-      <w:r>
-        <w:rPr>
-          <w:rFonts w:ascii="Times New Roman" w:hAnsi="Times New Roman" w:cs="Times New Roman"/>
-        </w:rPr>
-        <w:tab/>
-      </w:r>
-      <w:r>
-        <w:rPr>
-          <w:rFonts w:ascii="Times New Roman" w:hAnsi="Times New Roman" w:cs="Times New Roman"/>
-        </w:rPr>
-        <w:tab/>
-      </w:r>
-      <w:r>
-        <w:rPr>
-          <w:rFonts w:ascii="Times New Roman" w:hAnsi="Times New Roman" w:cs="Times New Roman"/>
-        </w:rPr>
-        <w:tab/>
-      </w:r>
-      <w:r>
-        <w:rPr>
-          <w:rFonts w:ascii="Times New Roman" w:hAnsi="Times New Roman" w:cs="Times New Roman"/>
-        </w:rPr>
-        <w:tab/>
-      </w:r>
-      <w:r>
-        <w:rPr>
-          <w:rFonts w:ascii="Times New Roman" w:hAnsi="Times New Roman" w:cs="Times New Roman"/>
-        </w:rPr>
-        <w:tab/>
-      </w:r>
-      <w:r>
-        <w:rPr>
-          <w:rFonts w:ascii="Times New Roman" w:hAnsi="Times New Roman" w:cs="Times New Roman"/>
-        </w:rPr>
-        <w:tab/>
-      </w:r>
-      <w:r>
-        <w:rPr>
-          <w:rFonts w:ascii="Times New Roman" w:hAnsi="Times New Roman" w:cs="Times New Roman"/>
-        </w:rPr>
-        <w:tab/>
-      </w:r>
-      <w:r>
-        <w:rPr>
-          <w:rFonts w:ascii="Times New Roman" w:hAnsi="Times New Roman" w:cs="Times New Roman"/>
-        </w:rPr>
-        <w:tab/>
-      </w:r>
-      <w:r>
-        <w:rPr>
-          <w:rFonts w:ascii="Times New Roman" w:hAnsi="Times New Roman" w:cs="Times New Roman"/>
-        </w:rPr>
-        <w:tab/>
-      </w:r>
-      <w:r>
-        <w:rPr>
-          <w:rFonts w:ascii="Times New Roman" w:hAnsi="Times New Roman" w:cs="Times New Roman"/>
-        </w:rPr>
-        <w:tab/>
-      </w:r>
-      <w:r>
-        <w:rPr>
-          <w:rFonts w:ascii="Times New Roman" w:hAnsi="Times New Roman" w:cs="Times New Roman"/>
-        </w:rPr>
-        <w:tab/>
-      </w:r>
-      <w:r>
-        <w:rPr>
-          <w:rFonts w:ascii="Times New Roman" w:hAnsi="Times New Roman" w:cs="Times New Roman"/>
-        </w:rPr>
-        <w:tab/>
-      </w:r>
-      <w:r>
-        <w:rPr>
-          <w:rFonts w:ascii="Times New Roman" w:hAnsi="Times New Roman" w:cs="Times New Roman"/>
-        </w:rPr>
-        <w:tab/>
-      </w:r>
-      <w:r>
-        <w:rPr>
-          <w:rFonts w:ascii="Times New Roman" w:hAnsi="Times New Roman" w:cs="Times New Roman"/>
-        </w:rPr>
-        <w:tab/>
-      </w:r>
-      <w:r>
-        <w:rPr>
-          <w:rFonts w:ascii="Times New Roman" w:hAnsi="Times New Roman" w:cs="Times New Roman"/>
-        </w:rPr>
-        <w:tab/>
-      </w:r>
-      <w:r>
-        <w:rPr>
-          <w:rFonts w:ascii="Times New Roman" w:hAnsi="Times New Roman" w:cs="Times New Roman"/>
-        </w:rPr>
-        <w:tab/>
-      </w:r>
-      <w:r>
-        <w:rPr>
-          <w:rFonts w:ascii="Times New Roman" w:hAnsi="Times New Roman" w:cs="Times New Roman"/>
-        </w:rPr>
-        <w:tab/>
-      </w:r>
-      <w:r>
-        <w:rPr>
-          <w:rFonts w:ascii="Times New Roman" w:hAnsi="Times New Roman" w:cs="Times New Roman"/>
-        </w:rPr>
-        <w:tab/>
-        <w:t>Kamina Botan</w:t>
+        <w:t xml:space="preserve">Kamina Botan</w:t>
       </w:r>
     </w:p>
     <w:p>
@@ -3681,6 +3567,9 @@
     </w:p>
     <w:p>
       <w:pPr>
+        <w:tabs>
+          <w:tab w:val="left" w:pos="3600"/>
+        </w:tabs>
         <w:spacing w:after="0" w:line="240" w:lineRule="auto"/>
         <w:rPr>
           <w:rFonts w:ascii="Times New Roman" w:hAnsi="Times New Roman" w:cs="Times New Roman"/>
@@ -3696,26 +3585,7 @@
         <w:rPr>
           <w:rFonts w:ascii="Times New Roman" w:hAnsi="Times New Roman" w:cs="Times New Roman"/>
         </w:rPr>
-        <w:tab/>
-      </w:r>
-      <w:r>
-        <w:rPr>
-          <w:rFonts w:ascii="Times New Roman" w:hAnsi="Times New Roman" w:cs="Times New Roman"/>
-        </w:rPr>
-        <w:tab/>
-      </w:r>
-      <w:r>
-        <w:rPr>
-          <w:rFonts w:ascii="Times New Roman" w:hAnsi="Times New Roman" w:cs="Times New Roman"/>
-        </w:rPr>
-        <w:tab/>
-      </w:r>
-      <w:r>
-        <w:rPr>
-          <w:rFonts w:ascii="Times New Roman" w:hAnsi="Times New Roman" w:cs="Times New Roman"/>
-        </w:rPr>
-        <w:tab/>
-        <w:t>Mengetahui,</w:t>
+        <w:t xml:space="preserve">Mengetahui,</w:t>
       </w:r>
     </w:p>
     <w:p>
@@ -3728,6 +3598,9 @@
     </w:p>
     <w:p>
       <w:pPr>
+        <w:tabs>
+          <w:tab w:val="left" w:pos="5760"/>
+        </w:tabs>
         <w:spacing w:after="0" w:line="240" w:lineRule="auto"/>
         <w:rPr>
           <w:rFonts w:ascii="Times New Roman" w:hAnsi="Times New Roman" w:cs="Times New Roman"/>
@@ -3738,84 +3611,22 @@
           <w:rFonts w:ascii="Times New Roman" w:hAnsi="Times New Roman" w:cs="Times New Roman"/>
           <w:lang w:val="en-US"/>
         </w:rPr>
-        <w:t xml:space="preserve">Dosen </w:t>
+        <w:t xml:space="preserve">Dosen Pembimbing,</w:t>
       </w:r>
-      <w:proofErr w:type="spellStart"/>
       <w:r>
         <w:rPr>
           <w:rFonts w:ascii="Times New Roman" w:hAnsi="Times New Roman" w:cs="Times New Roman"/>
           <w:lang w:val="en-US"/>
-        </w:rPr>
-        <w:t>Pembimbing</w:t>
-      </w:r>
-      <w:proofErr w:type="spellEnd"/>
-      <w:r>
-        <w:rPr>
-          <w:rFonts w:ascii="Times New Roman" w:hAnsi="Times New Roman" w:cs="Times New Roman"/>
-        </w:rPr>
-        <w:t>,</w:t>
-      </w:r>
-      <w:r>
-        <w:rPr>
-          <w:rFonts w:ascii="Times New Roman" w:hAnsi="Times New Roman" w:cs="Times New Roman"/>
         </w:rPr>
         <w:tab/>
       </w:r>
       <w:r>
         <w:rPr>
           <w:rFonts w:ascii="Times New Roman" w:hAnsi="Times New Roman" w:cs="Times New Roman"/>
-        </w:rPr>
-        <w:tab/>
-      </w:r>
-      <w:r>
-        <w:rPr>
-          <w:rFonts w:ascii="Times New Roman" w:hAnsi="Times New Roman" w:cs="Times New Roman"/>
-        </w:rPr>
-        <w:tab/>
-      </w:r>
-      <w:r>
-        <w:rPr>
-          <w:rFonts w:ascii="Times New Roman" w:hAnsi="Times New Roman" w:cs="Times New Roman"/>
-        </w:rPr>
-        <w:tab/>
-      </w:r>
-      <w:r>
-        <w:rPr>
-          <w:rFonts w:ascii="Times New Roman" w:hAnsi="Times New Roman" w:cs="Times New Roman"/>
-        </w:rPr>
-        <w:tab/>
-      </w:r>
-      <w:r>
-        <w:rPr>
-          <w:rFonts w:ascii="Times New Roman" w:hAnsi="Times New Roman" w:cs="Times New Roman"/>
-        </w:rPr>
-        <w:tab/>
-      </w:r>
-      <w:proofErr w:type="spellStart"/>
-      <w:r>
-        <w:rPr>
-          <w:rFonts w:ascii="Times New Roman" w:hAnsi="Times New Roman" w:cs="Times New Roman"/>
           <w:lang w:val="en-US"/>
         </w:rPr>
-        <w:t>Pembimbing</w:t>
+        <w:t xml:space="preserve">Pembimbing Lapangan</w:t>
       </w:r>
-      <w:proofErr w:type="spellEnd"/>
-      <w:r>
-        <w:rPr>
-          <w:rFonts w:ascii="Times New Roman" w:hAnsi="Times New Roman" w:cs="Times New Roman"/>
-          <w:lang w:val="en-US"/>
-        </w:rPr>
-        <w:t xml:space="preserve"> </w:t>
-      </w:r>
-      <w:proofErr w:type="spellStart"/>
-      <w:r>
-        <w:rPr>
-          <w:rFonts w:ascii="Times New Roman" w:hAnsi="Times New Roman" w:cs="Times New Roman"/>
-          <w:lang w:val="en-US"/>
-        </w:rPr>
-        <w:t>Lapangan</w:t>
-      </w:r>
-      <w:proofErr w:type="spellEnd"/>
     </w:p>
     <w:p>
       <w:pPr>
@@ -3851,6 +3662,9 @@
     </w:p>
     <w:p>
       <w:pPr>
+        <w:tabs>
+          <w:tab w:val="left" w:pos="5760"/>
+        </w:tabs>
         <w:spacing w:after="0" w:line="240" w:lineRule="auto"/>
         <w:rPr>
           <w:rFonts w:ascii="Times New Roman" w:hAnsi="Times New Roman" w:cs="Times New Roman"/>
@@ -3860,7 +3674,7 @@
         <w:rPr>
           <w:rFonts w:ascii="Times New Roman" w:hAnsi="Times New Roman" w:cs="Times New Roman"/>
         </w:rPr>
-        <w:t>Kagamihara Nadeshiko</w:t>
+        <w:t xml:space="preserve">Kagamihara Nadeshiko</w:t>
       </w:r>
       <w:r>
         <w:rPr>
@@ -3872,31 +3686,7 @@
         <w:rPr>
           <w:rFonts w:ascii="Times New Roman" w:hAnsi="Times New Roman" w:cs="Times New Roman"/>
         </w:rPr>
-        <w:tab/>
-      </w:r>
-      <w:r>
-        <w:rPr>
-          <w:rFonts w:ascii="Times New Roman" w:hAnsi="Times New Roman" w:cs="Times New Roman"/>
-        </w:rPr>
-        <w:tab/>
-      </w:r>
-      <w:r>
-        <w:rPr>
-          <w:rFonts w:ascii="Times New Roman" w:hAnsi="Times New Roman" w:cs="Times New Roman"/>
-        </w:rPr>
-        <w:tab/>
-      </w:r>
-      <w:r>
-        <w:rPr>
-          <w:rFonts w:ascii="Times New Roman" w:hAnsi="Times New Roman" w:cs="Times New Roman"/>
-        </w:rPr>
-        <w:tab/>
-      </w:r>
-      <w:r>
-        <w:rPr>
-          <w:rFonts w:ascii="Times New Roman" w:hAnsi="Times New Roman" w:cs="Times New Roman"/>
-        </w:rPr>
-        <w:t>Gotoh Hitori</w:t>
+        <w:t xml:space="preserve">Gotoh Hitori</w:t>
       </w:r>
     </w:p>
     <w:sectPr>

</xml_diff>